<commit_message>
:white_check_mark: Se corrige el problema de que el template tenía espacios invisibles que impedia el ingreso de algunos campos. De momento ya se genera el formato, falta que sea con los datos reales.
</commit_message>
<xml_diff>
--- a/app/infraestructure/formats/purchase/purchase_format.docx
+++ b/app/infraestructure/formats/purchase/purchase_format.docx
@@ -26,9 +26,9 @@
         <w:tblLook w:val="0000" w:noHBand="0" w:noVBand="0" w:firstColumn="0" w:lastRow="0" w:lastColumn="0" w:firstRow="0"/>
       </w:tblPr>
       <w:tblGrid>
-        <w:gridCol w:w="1342"/>
+        <w:gridCol w:w="1340"/>
         <w:gridCol w:w="1776"/>
-        <w:gridCol w:w="2197"/>
+        <w:gridCol w:w="2199"/>
         <w:gridCol w:w="1772"/>
         <w:gridCol w:w="1134"/>
         <w:gridCol w:w="568"/>
@@ -41,7 +41,7 @@
         </w:trPr>
         <w:tc>
           <w:tcPr>
-            <w:tcW w:w="1342" w:type="dxa"/>
+            <w:tcW w:w="1340" w:type="dxa"/>
             <w:vMerge w:val="restart"/>
             <w:tcBorders>
               <w:top w:val="single" w:sz="4" w:space="0" w:color="000000"/>
@@ -104,7 +104,7 @@
         </w:tc>
         <w:tc>
           <w:tcPr>
-            <w:tcW w:w="6879" w:type="dxa"/>
+            <w:tcW w:w="6881" w:type="dxa"/>
             <w:gridSpan w:val="4"/>
             <w:tcBorders>
               <w:top w:val="single" w:sz="4" w:space="0" w:color="000000"/>
@@ -177,7 +177,7 @@
         </w:trPr>
         <w:tc>
           <w:tcPr>
-            <w:tcW w:w="1342" w:type="dxa"/>
+            <w:tcW w:w="1340" w:type="dxa"/>
             <w:vMerge w:val="continue"/>
             <w:tcBorders>
               <w:top w:val="single" w:sz="4" w:space="0" w:color="000000"/>
@@ -206,7 +206,7 @@
         </w:tc>
         <w:tc>
           <w:tcPr>
-            <w:tcW w:w="6879" w:type="dxa"/>
+            <w:tcW w:w="6881" w:type="dxa"/>
             <w:gridSpan w:val="4"/>
             <w:tcBorders>
               <w:top w:val="single" w:sz="4" w:space="0" w:color="000000"/>
@@ -318,7 +318,7 @@
         </w:trPr>
         <w:tc>
           <w:tcPr>
-            <w:tcW w:w="3118" w:type="dxa"/>
+            <w:tcW w:w="3116" w:type="dxa"/>
             <w:gridSpan w:val="2"/>
             <w:tcBorders>
               <w:top w:val="single" w:sz="4" w:space="0" w:color="000000"/>
@@ -388,7 +388,7 @@
         </w:tc>
         <w:tc>
           <w:tcPr>
-            <w:tcW w:w="3969" w:type="dxa"/>
+            <w:tcW w:w="3971" w:type="dxa"/>
             <w:gridSpan w:val="2"/>
             <w:tcBorders>
               <w:top w:val="single" w:sz="4" w:space="0" w:color="000000"/>
@@ -490,23 +490,7 @@
                 <w:sz w:val="22"/>
                 <w:szCs w:val="22"/>
               </w:rPr>
-              <w:t>{{</w:t>
-            </w:r>
-            <w:r>
-              <w:rPr>
-                <w:rFonts w:cs="Calibri" w:ascii="Calibri" w:hAnsi="Calibri"/>
-                <w:sz w:val="22"/>
-                <w:szCs w:val="22"/>
-              </w:rPr>
-              <w:t>cost_center</w:t>
-            </w:r>
-            <w:r>
-              <w:rPr>
-                <w:rFonts w:cs="Calibri" w:ascii="Calibri" w:hAnsi="Calibri"/>
-                <w:sz w:val="22"/>
-                <w:szCs w:val="22"/>
-              </w:rPr>
-              <w:t>}}</w:t>
+              <w:t>{{cost_center}}</w:t>
             </w:r>
           </w:p>
         </w:tc>
@@ -1150,34 +1134,7 @@
                 <w:sz w:val="22"/>
                 <w:szCs w:val="22"/>
               </w:rPr>
-              <w:t xml:space="preserve">SI EXISTE </w:t>
-            </w:r>
-            <w:r>
-              <w:rPr>
-                <w:rFonts w:cs="Calibri" w:ascii="Calibri" w:hAnsi="Calibri"/>
-                <w:color w:val="000000"/>
-                <w:sz w:val="22"/>
-                <w:szCs w:val="22"/>
-              </w:rPr>
-              <w:t>{{marco_yes}}</w:t>
-            </w:r>
-            <w:r>
-              <w:rPr>
-                <w:rFonts w:cs="Calibri" w:ascii="Calibri" w:hAnsi="Calibri"/>
-                <w:color w:val="000000"/>
-                <w:sz w:val="22"/>
-                <w:szCs w:val="22"/>
-              </w:rPr>
-              <w:t xml:space="preserve">                                      NO EXISTE </w:t>
-            </w:r>
-            <w:r>
-              <w:rPr>
-                <w:rFonts w:cs="Calibri" w:ascii="Calibri" w:hAnsi="Calibri"/>
-                <w:color w:val="000000"/>
-                <w:sz w:val="22"/>
-                <w:szCs w:val="22"/>
-              </w:rPr>
-              <w:t>{{marco_no}}</w:t>
+              <w:t>SI EXISTE {{marco_yes}}                                      NO EXISTE {{marco_no}}</w:t>
             </w:r>
           </w:p>
         </w:tc>
@@ -1273,96 +1230,14 @@
                 <w:rFonts w:cs="Calibri" w:ascii="Calibri" w:hAnsi="Calibri"/>
                 <w:szCs w:val="24"/>
               </w:rPr>
-              <w:t xml:space="preserve">Resultado de la consulta en el Plan Anual de Compras  </w:t>
-            </w:r>
-            <w:sdt>
-              <w:sdtPr>
-                <w14:checkbox>
-                  <w14:checked w:val="0"/>
-                  <w14:checkedState w:val="2612"/>
-                  <w14:uncheckedState w:val="2610"/>
-                </w14:checkbox>
-                <w:id w:val="321551609"/>
-              </w:sdtPr>
-              <w:sdtContent>
-                <w:r>
-                  <w:rPr>
-                    <w:rFonts w:eastAsia="MS Gothic" w:cs="Segoe UI Symbol" w:ascii="Segoe UI Symbol" w:hAnsi="Segoe UI Symbol"/>
-                    <w:szCs w:val="24"/>
-                  </w:rPr>
-                  <w:t>{{</w:t>
-                </w:r>
-                <w:r>
-                  <w:rPr>
-                    <w:rFonts w:eastAsia="MS Gothic" w:cs="Segoe UI Symbol" w:ascii="Segoe UI Symbol" w:hAnsi="Segoe UI Symbol"/>
-                    <w:szCs w:val="24"/>
-                  </w:rPr>
-                  <w:t>annual_plan</w:t>
-                </w:r>
-                <w:r>
-                  <w:rPr>
-                    <w:rFonts w:eastAsia="MS Gothic" w:cs="Segoe UI Symbol" w:ascii="Segoe UI Symbol" w:hAnsi="Segoe UI Symbol"/>
-                    <w:szCs w:val="24"/>
-                  </w:rPr>
-                  <w:t>}}</w:t>
-                </w:r>
-              </w:sdtContent>
-            </w:sdt>
+              <w:t xml:space="preserve">Resultado de la consulta en el Plan Anual de Compras </w:t>
+            </w:r>
             <w:r>
               <w:rPr>
                 <w:rFonts w:cs="Calibri" w:ascii="Calibri" w:hAnsi="Calibri"/>
                 <w:szCs w:val="24"/>
               </w:rPr>
-              <w:t xml:space="preserve">     Código de registro</w:t>
-            </w:r>
-            <w:bookmarkStart w:id="0" w:name="_GoBack"/>
-            <w:bookmarkEnd w:id="0"/>
-            <w:r>
-              <w:rPr>
-                <w:rFonts w:cs="Calibri" w:ascii="Calibri" w:hAnsi="Calibri"/>
-                <w:szCs w:val="24"/>
-              </w:rPr>
-              <w:t xml:space="preserve">: </w:t>
-            </w:r>
-            <w:r>
-              <w:rPr>
-                <w:rFonts w:cs="Calibri" w:ascii="Calibri" w:hAnsi="Calibri"/>
-                <w:szCs w:val="24"/>
-              </w:rPr>
-              <w:t>{{</w:t>
-            </w:r>
-            <w:r>
-              <w:rPr>
-                <w:rFonts w:cs="Calibri" w:ascii="Calibri" w:hAnsi="Calibri"/>
-                <w:szCs w:val="24"/>
-              </w:rPr>
-              <w:t>code_annual_plan</w:t>
-            </w:r>
-            <w:r>
-              <w:rPr>
-                <w:rFonts w:cs="Calibri" w:ascii="Calibri" w:hAnsi="Calibri"/>
-                <w:szCs w:val="24"/>
-              </w:rPr>
-              <w:t>}}</w:t>
-            </w:r>
-          </w:p>
-          <w:p>
-            <w:pPr>
-              <w:pStyle w:val="Normal"/>
-              <w:widowControl w:val="false"/>
-              <w:ind w:left="360" w:hanging="0"/>
-              <w:rPr>
-                <w:rFonts w:ascii="Calibri" w:hAnsi="Calibri" w:cs="Calibri"/>
-                <w:sz w:val="22"/>
-                <w:szCs w:val="22"/>
-              </w:rPr>
-            </w:pPr>
-            <w:r>
-              <w:rPr>
-                <w:rFonts w:cs="Calibri" w:ascii="Calibri" w:hAnsi="Calibri"/>
-                <w:sz w:val="22"/>
-                <w:szCs w:val="22"/>
-              </w:rPr>
+              <w:t>{{annual_plan}}</w:t>
             </w:r>
           </w:p>
           <w:p>
@@ -1383,86 +1258,16 @@
                 <w:rFonts w:cs="Calibri" w:ascii="Calibri" w:hAnsi="Calibri"/>
                 <w:szCs w:val="24"/>
               </w:rPr>
-              <w:t xml:space="preserve">Resultado de la consulta al Banco Universitario de Programas y Proyectos </w:t>
-            </w:r>
-            <w:sdt>
-              <w:sdtPr>
-                <w14:checkbox>
-                  <w14:checked w:val="0"/>
-                  <w14:checkedState w:val="2612"/>
-                  <w14:uncheckedState w:val="2610"/>
-                </w14:checkbox>
-                <w:id w:val="1712076279"/>
-              </w:sdtPr>
-              <w:sdtContent>
-                <w:r>
-                  <w:rPr>
-                    <w:rFonts w:eastAsia="MS Gothic" w:cs="Segoe UI Symbol" w:ascii="Segoe UI Symbol" w:hAnsi="Segoe UI Symbol"/>
-                    <w:szCs w:val="24"/>
-                  </w:rPr>
-                  <w:t>{{</w:t>
-                </w:r>
-                <w:r>
-                  <w:rPr>
-                    <w:rFonts w:eastAsia="MS Gothic" w:cs="Segoe UI Symbol" w:ascii="Segoe UI Symbol" w:hAnsi="Segoe UI Symbol"/>
-                    <w:szCs w:val="24"/>
-                  </w:rPr>
-                  <w:t>bank_consultation</w:t>
-                </w:r>
-                <w:r>
-                  <w:rPr>
-                    <w:rFonts w:eastAsia="MS Gothic" w:cs="Segoe UI Symbol" w:ascii="Segoe UI Symbol" w:hAnsi="Segoe UI Symbol"/>
-                    <w:szCs w:val="24"/>
-                  </w:rPr>
-                  <w:t>}}</w:t>
-                </w:r>
-              </w:sdtContent>
-            </w:sdt>
+              <w:t>Código de registro</w:t>
+            </w:r>
+            <w:bookmarkStart w:id="0" w:name="_GoBack"/>
+            <w:bookmarkEnd w:id="0"/>
             <w:r>
               <w:rPr>
                 <w:rFonts w:cs="Calibri" w:ascii="Calibri" w:hAnsi="Calibri"/>
                 <w:szCs w:val="24"/>
               </w:rPr>
-              <w:t xml:space="preserve">  </w:t>
-            </w:r>
-          </w:p>
-          <w:p>
-            <w:pPr>
-              <w:pStyle w:val="ListParagraph"/>
-              <w:widowControl w:val="false"/>
-              <w:ind w:left="720" w:hanging="0"/>
-              <w:rPr>
-                <w:rFonts w:ascii="Calibri" w:hAnsi="Calibri" w:cs="Calibri"/>
-                <w:szCs w:val="24"/>
-              </w:rPr>
-            </w:pPr>
-            <w:r>
-              <w:rPr>
-                <w:rFonts w:cs="Calibri" w:ascii="Calibri" w:hAnsi="Calibri"/>
-                <w:szCs w:val="24"/>
-              </w:rPr>
-              <w:t xml:space="preserve">Código de la ficha del proyecto: </w:t>
-            </w:r>
-            <w:r>
-              <w:rPr>
-                <w:rFonts w:cs="Calibri" w:ascii="Calibri" w:hAnsi="Calibri"/>
-                <w:szCs w:val="24"/>
-              </w:rPr>
-              <w:t>{{</w:t>
-            </w:r>
-            <w:r>
-              <w:rPr>
-                <w:rFonts w:cs="Calibri" w:ascii="Calibri" w:hAnsi="Calibri"/>
-                <w:szCs w:val="24"/>
-              </w:rPr>
-              <w:t>code_bank_consultation</w:t>
-            </w:r>
-            <w:r>
-              <w:rPr>
-                <w:rFonts w:cs="Calibri" w:ascii="Calibri" w:hAnsi="Calibri"/>
-                <w:szCs w:val="24"/>
-              </w:rPr>
-              <w:t>}}</w:t>
+              <w:t>: {{code_annual_plan}}</w:t>
             </w:r>
           </w:p>
           <w:p>
@@ -1494,6 +1299,7 @@
               </w:numPr>
               <w:rPr>
                 <w:rFonts w:ascii="Calibri" w:hAnsi="Calibri" w:cs="Calibri"/>
+                <w:szCs w:val="24"/>
               </w:rPr>
             </w:pPr>
             <w:r>
@@ -1501,14 +1307,67 @@
                 <w:rFonts w:cs="Calibri" w:ascii="Calibri" w:hAnsi="Calibri"/>
                 <w:szCs w:val="24"/>
               </w:rPr>
-              <w:t xml:space="preserve">Número del Contrato o convenio: </w:t>
-            </w:r>
+              <w:t>Resultado de la consulta al Banco Universitario de Programas y Proyectos {{bank_consultation}}</w:t>
+            </w:r>
+          </w:p>
+          <w:p>
+            <w:pPr>
+              <w:pStyle w:val="ListParagraph"/>
+              <w:widowControl w:val="false"/>
+              <w:numPr>
+                <w:ilvl w:val="0"/>
+                <w:numId w:val="2"/>
+              </w:numPr>
+              <w:rPr>
+                <w:rFonts w:ascii="Calibri" w:hAnsi="Calibri" w:cs="Calibri"/>
+                <w:szCs w:val="24"/>
+              </w:rPr>
+            </w:pPr>
             <w:r>
               <w:rPr>
                 <w:rFonts w:cs="Calibri" w:ascii="Calibri" w:hAnsi="Calibri"/>
                 <w:szCs w:val="24"/>
               </w:rPr>
-              <w:t>{{contract}}</w:t>
+              <w:t>Código de la ficha del proyecto: {{code_bank_consultation}}</w:t>
+            </w:r>
+          </w:p>
+          <w:p>
+            <w:pPr>
+              <w:pStyle w:val="Normal"/>
+              <w:widowControl w:val="false"/>
+              <w:ind w:left="360" w:hanging="0"/>
+              <w:rPr>
+                <w:rFonts w:ascii="Calibri" w:hAnsi="Calibri" w:cs="Calibri"/>
+                <w:sz w:val="22"/>
+                <w:szCs w:val="22"/>
+              </w:rPr>
+            </w:pPr>
+            <w:r>
+              <w:rPr>
+                <w:rFonts w:cs="Calibri" w:ascii="Calibri" w:hAnsi="Calibri"/>
+                <w:sz w:val="22"/>
+                <w:szCs w:val="22"/>
+              </w:rPr>
+            </w:r>
+          </w:p>
+          <w:p>
+            <w:pPr>
+              <w:pStyle w:val="ListParagraph"/>
+              <w:widowControl w:val="false"/>
+              <w:numPr>
+                <w:ilvl w:val="0"/>
+                <w:numId w:val="2"/>
+              </w:numPr>
+              <w:rPr>
+                <w:rFonts w:ascii="Calibri" w:hAnsi="Calibri" w:cs="Calibri"/>
+              </w:rPr>
+            </w:pPr>
+            <w:r>
+              <w:rPr>
+                <w:rFonts w:cs="Calibri" w:ascii="Calibri" w:hAnsi="Calibri"/>
+                <w:szCs w:val="24"/>
+              </w:rPr>
+              <w:t>Número del Contrato o convenio: {{contract}}</w:t>
             </w:r>
           </w:p>
           <w:p>
@@ -3127,6 +2986,7 @@
     <w:rsid w:val="0014411c"/>
     <w:pPr>
       <w:widowControl/>
+      <w:suppressAutoHyphens w:val="true"/>
       <w:bidi w:val="0"/>
       <w:spacing w:lineRule="auto" w:line="240" w:before="0" w:after="0"/>
       <w:jc w:val="left"/>
@@ -3373,6 +3233,7 @@
     <w:rsid w:val="0014411c"/>
     <w:pPr>
       <w:widowControl w:val="false"/>
+      <w:suppressAutoHyphens w:val="true"/>
       <w:bidi w:val="0"/>
       <w:spacing w:lineRule="auto" w:line="240" w:before="0" w:after="0"/>
       <w:jc w:val="left"/>
@@ -3383,7 +3244,7 @@
       <w:kern w:val="0"/>
       <w:sz w:val="24"/>
       <w:szCs w:val="24"/>
-      <w:lang w:eastAsia="es-CO" w:val="es-CO" w:bidi="ar-SA"/>
+      <w:lang w:val="es-CO" w:eastAsia="es-CO" w:bidi="ar-SA"/>
     </w:rPr>
   </w:style>
   <w:style w:type="paragraph" w:styleId="Header">
@@ -3457,6 +3318,29 @@
       <w:rFonts w:ascii="Liberation Mono" w:hAnsi="Liberation Mono" w:eastAsia="Liberation Mono" w:cs="Liberation Mono"/>
       <w:sz w:val="20"/>
       <w:szCs w:val="20"/>
+    </w:rPr>
+  </w:style>
+  <w:style w:type="paragraph" w:styleId="TableContents">
+    <w:name w:val="Table Contents"/>
+    <w:basedOn w:val="Normal"/>
+    <w:qFormat/>
+    <w:pPr>
+      <w:widowControl w:val="false"/>
+      <w:suppressLineNumbers/>
+    </w:pPr>
+    <w:rPr/>
+  </w:style>
+  <w:style w:type="paragraph" w:styleId="TableHeading">
+    <w:name w:val="Table Heading"/>
+    <w:basedOn w:val="TableContents"/>
+    <w:qFormat/>
+    <w:pPr>
+      <w:suppressLineNumbers/>
+      <w:jc w:val="center"/>
+    </w:pPr>
+    <w:rPr>
+      <w:b/>
+      <w:bCs/>
     </w:rPr>
   </w:style>
   <w:style w:type="numbering" w:styleId="NoList" w:default="1">

</xml_diff>

<commit_message>
:clown_face: Se agrega el responsible_condition que faltaba en el formato de compras
</commit_message>
<xml_diff>
--- a/app/infraestructure/formats/purchase/purchase_format.docx
+++ b/app/infraestructure/formats/purchase/purchase_format.docx
@@ -26,9 +26,9 @@
         <w:tblLook w:val="0000" w:noHBand="0" w:noVBand="0" w:firstColumn="0" w:lastRow="0" w:lastColumn="0" w:firstRow="0"/>
       </w:tblPr>
       <w:tblGrid>
-        <w:gridCol w:w="1340"/>
+        <w:gridCol w:w="1339"/>
         <w:gridCol w:w="1776"/>
-        <w:gridCol w:w="2199"/>
+        <w:gridCol w:w="2200"/>
         <w:gridCol w:w="1772"/>
         <w:gridCol w:w="1134"/>
         <w:gridCol w:w="568"/>
@@ -41,7 +41,7 @@
         </w:trPr>
         <w:tc>
           <w:tcPr>
-            <w:tcW w:w="1340" w:type="dxa"/>
+            <w:tcW w:w="1339" w:type="dxa"/>
             <w:vMerge w:val="restart"/>
             <w:tcBorders>
               <w:top w:val="single" w:sz="4" w:space="0" w:color="000000"/>
@@ -104,7 +104,7 @@
         </w:tc>
         <w:tc>
           <w:tcPr>
-            <w:tcW w:w="6881" w:type="dxa"/>
+            <w:tcW w:w="6882" w:type="dxa"/>
             <w:gridSpan w:val="4"/>
             <w:tcBorders>
               <w:top w:val="single" w:sz="4" w:space="0" w:color="000000"/>
@@ -177,7 +177,7 @@
         </w:trPr>
         <w:tc>
           <w:tcPr>
-            <w:tcW w:w="1340" w:type="dxa"/>
+            <w:tcW w:w="1339" w:type="dxa"/>
             <w:vMerge w:val="continue"/>
             <w:tcBorders>
               <w:top w:val="single" w:sz="4" w:space="0" w:color="000000"/>
@@ -206,7 +206,7 @@
         </w:tc>
         <w:tc>
           <w:tcPr>
-            <w:tcW w:w="6881" w:type="dxa"/>
+            <w:tcW w:w="6882" w:type="dxa"/>
             <w:gridSpan w:val="4"/>
             <w:tcBorders>
               <w:top w:val="single" w:sz="4" w:space="0" w:color="000000"/>
@@ -318,7 +318,7 @@
         </w:trPr>
         <w:tc>
           <w:tcPr>
-            <w:tcW w:w="3116" w:type="dxa"/>
+            <w:tcW w:w="3115" w:type="dxa"/>
             <w:gridSpan w:val="2"/>
             <w:tcBorders>
               <w:top w:val="single" w:sz="4" w:space="0" w:color="000000"/>
@@ -388,7 +388,7 @@
         </w:tc>
         <w:tc>
           <w:tcPr>
-            <w:tcW w:w="3971" w:type="dxa"/>
+            <w:tcW w:w="3972" w:type="dxa"/>
             <w:gridSpan w:val="2"/>
             <w:tcBorders>
               <w:top w:val="single" w:sz="4" w:space="0" w:color="000000"/>
@@ -837,7 +837,16 @@
                 <w:szCs w:val="22"/>
                 <w:lang w:val="es-ES_tradnl"/>
               </w:rPr>
-              <w:t>Competente:</w:t>
+              <w:t xml:space="preserve">Competente </w:t>
+            </w:r>
+            <w:r>
+              <w:rPr>
+                <w:rFonts w:cs="Calibri" w:ascii="Calibri" w:hAnsi="Calibri"/>
+                <w:sz w:val="22"/>
+                <w:szCs w:val="22"/>
+                <w:lang w:val="es-ES_tradnl"/>
+              </w:rPr>
+              <w:t>{{responsible_condition}}</w:t>
             </w:r>
           </w:p>
           <w:p>
@@ -1230,14 +1239,7 @@
                 <w:rFonts w:cs="Calibri" w:ascii="Calibri" w:hAnsi="Calibri"/>
                 <w:szCs w:val="24"/>
               </w:rPr>
-              <w:t xml:space="preserve">Resultado de la consulta en el Plan Anual de Compras </w:t>
-            </w:r>
-            <w:r>
-              <w:rPr>
-                <w:rFonts w:cs="Calibri" w:ascii="Calibri" w:hAnsi="Calibri"/>
-                <w:szCs w:val="24"/>
-              </w:rPr>
-              <w:t>{{annual_plan}}</w:t>
+              <w:t>Resultado de la consulta en el Plan Anual de Compras {{annual_plan}}</w:t>
             </w:r>
           </w:p>
           <w:p>

</xml_diff>

<commit_message>
:clown_face: Se agrega el responsible_condition que faltaba en el formato de compras (#108)
</commit_message>
<xml_diff>
--- a/app/infraestructure/formats/purchase/purchase_format.docx
+++ b/app/infraestructure/formats/purchase/purchase_format.docx
@@ -26,9 +26,9 @@
         <w:tblLook w:val="0000" w:noHBand="0" w:noVBand="0" w:firstColumn="0" w:lastRow="0" w:lastColumn="0" w:firstRow="0"/>
       </w:tblPr>
       <w:tblGrid>
-        <w:gridCol w:w="1340"/>
+        <w:gridCol w:w="1339"/>
         <w:gridCol w:w="1776"/>
-        <w:gridCol w:w="2199"/>
+        <w:gridCol w:w="2200"/>
         <w:gridCol w:w="1772"/>
         <w:gridCol w:w="1134"/>
         <w:gridCol w:w="568"/>
@@ -41,7 +41,7 @@
         </w:trPr>
         <w:tc>
           <w:tcPr>
-            <w:tcW w:w="1340" w:type="dxa"/>
+            <w:tcW w:w="1339" w:type="dxa"/>
             <w:vMerge w:val="restart"/>
             <w:tcBorders>
               <w:top w:val="single" w:sz="4" w:space="0" w:color="000000"/>
@@ -104,7 +104,7 @@
         </w:tc>
         <w:tc>
           <w:tcPr>
-            <w:tcW w:w="6881" w:type="dxa"/>
+            <w:tcW w:w="6882" w:type="dxa"/>
             <w:gridSpan w:val="4"/>
             <w:tcBorders>
               <w:top w:val="single" w:sz="4" w:space="0" w:color="000000"/>
@@ -177,7 +177,7 @@
         </w:trPr>
         <w:tc>
           <w:tcPr>
-            <w:tcW w:w="1340" w:type="dxa"/>
+            <w:tcW w:w="1339" w:type="dxa"/>
             <w:vMerge w:val="continue"/>
             <w:tcBorders>
               <w:top w:val="single" w:sz="4" w:space="0" w:color="000000"/>
@@ -206,7 +206,7 @@
         </w:tc>
         <w:tc>
           <w:tcPr>
-            <w:tcW w:w="6881" w:type="dxa"/>
+            <w:tcW w:w="6882" w:type="dxa"/>
             <w:gridSpan w:val="4"/>
             <w:tcBorders>
               <w:top w:val="single" w:sz="4" w:space="0" w:color="000000"/>
@@ -318,7 +318,7 @@
         </w:trPr>
         <w:tc>
           <w:tcPr>
-            <w:tcW w:w="3116" w:type="dxa"/>
+            <w:tcW w:w="3115" w:type="dxa"/>
             <w:gridSpan w:val="2"/>
             <w:tcBorders>
               <w:top w:val="single" w:sz="4" w:space="0" w:color="000000"/>
@@ -388,7 +388,7 @@
         </w:tc>
         <w:tc>
           <w:tcPr>
-            <w:tcW w:w="3971" w:type="dxa"/>
+            <w:tcW w:w="3972" w:type="dxa"/>
             <w:gridSpan w:val="2"/>
             <w:tcBorders>
               <w:top w:val="single" w:sz="4" w:space="0" w:color="000000"/>
@@ -837,7 +837,16 @@
                 <w:szCs w:val="22"/>
                 <w:lang w:val="es-ES_tradnl"/>
               </w:rPr>
-              <w:t>Competente:</w:t>
+              <w:t xml:space="preserve">Competente </w:t>
+            </w:r>
+            <w:r>
+              <w:rPr>
+                <w:rFonts w:cs="Calibri" w:ascii="Calibri" w:hAnsi="Calibri"/>
+                <w:sz w:val="22"/>
+                <w:szCs w:val="22"/>
+                <w:lang w:val="es-ES_tradnl"/>
+              </w:rPr>
+              <w:t>{{responsible_condition}}</w:t>
             </w:r>
           </w:p>
           <w:p>
@@ -1230,14 +1239,7 @@
                 <w:rFonts w:cs="Calibri" w:ascii="Calibri" w:hAnsi="Calibri"/>
                 <w:szCs w:val="24"/>
               </w:rPr>
-              <w:t xml:space="preserve">Resultado de la consulta en el Plan Anual de Compras </w:t>
-            </w:r>
-            <w:r>
-              <w:rPr>
-                <w:rFonts w:cs="Calibri" w:ascii="Calibri" w:hAnsi="Calibri"/>
-                <w:szCs w:val="24"/>
-              </w:rPr>
-              <w:t>{{annual_plan}}</w:t>
+              <w:t>Resultado de la consulta en el Plan Anual de Compras {{annual_plan}}</w:t>
             </w:r>
           </w:p>
           <w:p>

</xml_diff>